<commit_message>
docs(clase1): diligenciar bitacora digital de la semana 3 (05/08/2026)
Bloque A: resumen de Calidad, Verificacion y Validacion, IEEE Std 1028-2008,
los cinco tipos de revision, la Revision Administrativa (objetivos, entradas,
salidas, roles y procedimiento) y la revision entre pares.
Bloque A 2.2: tareas de la sesion con sus entregables y evidencia adjunta.
Bloque B: 5.0 horas de trabajo independiente registradas.
Bloque C: trazabilidad de commits del repositorio.
Bloque D: bloqueos, mitigacion y plan de accion para la semana siguiente.
</commit_message>
<xml_diff>
--- a/Clase#1/Plantilla_Bitacora_Digital_Software4.docx
+++ b/Clase#1/Plantilla_Bitacora_Digital_Software4.docx
@@ -104,7 +104,7 @@
               <w:rPr>
                 <w:sz w:val="21"/>
               </w:rPr>
-              <w:t>[Nombre Completo]</w:t>
+              <w:t xml:space="preserve">Andres Felipe Velez Alcaraz</w:t>
             </w:r>
           </w:p>
         </w:tc>
@@ -155,7 +155,7 @@
               <w:rPr>
                 <w:sz w:val="21"/>
               </w:rPr>
-              <w:t>001</w:t>
+              <w:t xml:space="preserve">1017245136</w:t>
             </w:r>
           </w:p>
         </w:tc>
@@ -202,67 +202,13 @@
             <w:pPr>
               <w:spacing w:after="0"/>
             </w:pPr>
-            <w:r>
-              <w:rPr>
-                <w:sz w:val="21"/>
-              </w:rPr>
-              <w:t xml:space="preserve">Semana N° </w:t>
-            </w:r>
-            <w:r>
-              <w:rPr>
-                <w:sz w:val="21"/>
-              </w:rPr>
-              <w:t>1</w:t>
-            </w:r>
-            <w:r>
-              <w:rPr>
-                <w:sz w:val="21"/>
-              </w:rPr>
-              <w:t xml:space="preserve">   |   </w:t>
-            </w:r>
             <w:proofErr w:type="spellStart"/>
-            <w:r>
-              <w:rPr>
-                <w:sz w:val="21"/>
-              </w:rPr>
-              <w:t>Fecha</w:t>
-            </w:r>
             <w:proofErr w:type="spellEnd"/>
             <w:r>
               <w:rPr>
                 <w:sz w:val="21"/>
               </w:rPr>
-              <w:t xml:space="preserve">: </w:t>
-            </w:r>
-            <w:r>
-              <w:rPr>
-                <w:sz w:val="21"/>
-              </w:rPr>
-              <w:t>05</w:t>
-            </w:r>
-            <w:r>
-              <w:rPr>
-                <w:sz w:val="21"/>
-              </w:rPr>
-              <w:t>/</w:t>
-            </w:r>
-            <w:r>
-              <w:rPr>
-                <w:sz w:val="21"/>
-              </w:rPr>
-              <w:t>08</w:t>
-            </w:r>
-            <w:r>
-              <w:rPr>
-                <w:sz w:val="21"/>
-              </w:rPr>
-              <w:t>/</w:t>
-            </w:r>
-            <w:r>
-              <w:rPr>
-                <w:sz w:val="21"/>
-              </w:rPr>
-              <w:t>2026</w:t>
+              <w:t xml:space="preserve">Semana N° 3   |   Fecha: 05/08/2026</w:t>
             </w:r>
           </w:p>
         </w:tc>
@@ -313,7 +259,7 @@
               <w:rPr>
                 <w:sz w:val="21"/>
               </w:rPr>
-              <w:t>[Nombre del Proyecto, ej: PetCare Hub / CampusFix]</w:t>
+              <w:t xml:space="preserve">Exposición de un proceso específico del software — “Inspección” (IEEE Std 1028-2008)</w:t>
             </w:r>
           </w:p>
         </w:tc>
@@ -364,7 +310,7 @@
               <w:rPr>
                 <w:sz w:val="21"/>
               </w:rPr>
-              <w:t>[ej. Backend Developer / QA Engineer / DBA]</w:t>
+              <w:t xml:space="preserve">RECODER / módulo estandarización IEEE 1028-2008</w:t>
             </w:r>
           </w:p>
         </w:tc>
@@ -431,7 +377,10 @@
         <w:t xml:space="preserve">• Tema Principal: </w:t>
       </w:r>
       <w:r>
-        <w:t>[Título de la sesión de clase]</w:t>
+        <w:rPr>
+          <w:b w:val="0"/>
+        </w:rPr>
+        <w:t xml:space="preserve">Calidad de Software, Verificación y Validación (IEEE Std 1028-2008)</w:t>
       </w:r>
     </w:p>
     <w:p>
@@ -442,7 +391,24 @@
         <w:rPr>
           <w:b/>
         </w:rPr>
-        <w:t>• Síntesis de Conceptos:</w:t>
+        <w:t xml:space="preserve"/>
+      </w:r>
+      <w:r>
+        <w:rPr>
+          <w:b w:val="0"/>
+        </w:rPr>
+        <w:t xml:space="preserve">Primera sesión del curso. Se explicó qué se entiende por calidad en un proyecto de software y cuáles son las técnicas para revisar los artefactos antes de escribir código.</w:t>
+      </w:r>
+    </w:p>
+    <w:p>
+      <w:pPr>
+        <w:spacing w:after="80"/>
+      </w:pPr>
+      <w:r>
+        <w:rPr>
+          <w:b/>
+        </w:rPr>
+        <w:t xml:space="preserve">• Síntesis de Conceptos:</w:t>
       </w:r>
     </w:p>
     <w:p>
@@ -454,30 +420,162 @@
         <w:rPr>
           <w:b/>
         </w:rPr>
-        <w:t xml:space="preserve">Concepto 1: </w:t>
+        <w:t xml:space="preserve">Concepto 1 — Calidad: </w:t>
       </w:r>
       <w:r>
-        <w:t>[Explicación breve del primer concepto clave de la sesión]</w:t>
+        <w:rPr>
+          <w:b w:val="0"/>
+        </w:rPr>
+        <w:t xml:space="preserve">Es el grado en que un proyecto cumple los requisitos pactados. Hacer más de lo pedido no es calidad: eso se llama gold plating (trabajo extra que el cliente no pidió ni paga). El análisis marginal ayuda a decidir hasta dónde vale la pena seguir mejorando.</w:t>
       </w:r>
     </w:p>
     <w:p>
       <w:pPr>
         <w:pStyle w:val="Listaconvietas"/>
-        <w:spacing w:after="80"/>
+        <w:spacing w:after="40"/>
       </w:pPr>
       <w:r>
         <w:rPr>
           <w:b/>
         </w:rPr>
-        <w:t xml:space="preserve">Concepto 2: </w:t>
+        <w:t xml:space="preserve">Concepto 2 — Verificación: </w:t>
       </w:r>
       <w:r>
-        <w:t>[Explicación breve del segundo concepto clave de la sesión]</w:t>
+        <w:rPr>
+          <w:b w:val="0"/>
+        </w:rPr>
+        <w:t xml:space="preserve">Responde a la pregunta “¿estamos construyendo el producto correctamente?” (Boehm). Comprueba que el software esté de acuerdo con su especificación. No implica la ejecución de código, utiliza revisiones, recorridos, inspecciones y verificación documental, encuentra los errores al principio del ciclo de desarrollo y la realiza el equipo de control de calidad.</w:t>
       </w:r>
     </w:p>
     <w:p>
       <w:pPr>
-        <w:spacing w:after="160"/>
+        <w:pStyle w:val="Listaconvietas"/>
+        <w:spacing w:after="40"/>
+      </w:pPr>
+      <w:r>
+        <w:rPr>
+          <w:b/>
+        </w:rPr>
+        <w:t xml:space="preserve">Concepto 3 — Validación: </w:t>
+      </w:r>
+      <w:r>
+        <w:rPr>
+          <w:b w:val="0"/>
+        </w:rPr>
+        <w:t xml:space="preserve">Responde a la pregunta “¿estamos construyendo el producto correcto?”. Comprueba que el software haga lo que el usuario espera. Sí implica la ejecución de código, utiliza pruebas de caja negra, caja blanca y pruebas no funcionales, y encuentra los errores que la verificación no puede detectar.</w:t>
+      </w:r>
+    </w:p>
+    <w:p>
+      <w:pPr>
+        <w:pStyle w:val="Listaconvietas"/>
+        <w:spacing w:after="40"/>
+      </w:pPr>
+      <w:r>
+        <w:rPr>
+          <w:b/>
+        </w:rPr>
+        <w:t xml:space="preserve">Concepto 4 — IEEE Std 1028-2008: </w:t>
+      </w:r>
+      <w:r>
+        <w:rPr>
+          <w:b w:val="0"/>
+        </w:rPr>
+        <w:t xml:space="preserve">Estándar para revisiones y auditorías de software. Define cinco tipos de revisión con procedimientos sistemáticos para su ejecución y aplica a todo el ciclo de vida: adquisición, suministro, desarrollo, operación y mantenimiento. Su enfoque es participación en equipo, resultados documentados y procedimientos establecidos.</w:t>
+      </w:r>
+    </w:p>
+    <w:p>
+      <w:pPr>
+        <w:pStyle w:val="Listaconvietas"/>
+        <w:spacing w:after="40"/>
+      </w:pPr>
+      <w:r>
+        <w:rPr>
+          <w:b/>
+        </w:rPr>
+        <w:t xml:space="preserve">Concepto 5 — Los cinco tipos de revisión: </w:t>
+      </w:r>
+      <w:r>
+        <w:rPr>
+          <w:b w:val="0"/>
+        </w:rPr>
+        <w:t xml:space="preserve">Revisiones de Gestión (monitorean el progreso, los planes y los cronogramas); Revisiones Técnicas (un equipo calificado evalúa la idoneidad del producto e identifica discrepancias); Inspecciones (examen sistemático por pares para detectar anomalías, liderado por un facilitador imparcial capacitado); Walk-throughs (análisis estático donde el autor guía al equipo y recibe preguntas y comentarios); y Auditorías (examen independiente hecho por un tercero para evaluar el cumplimiento de especificaciones y estándares).</w:t>
+      </w:r>
+    </w:p>
+    <w:p>
+      <w:pPr>
+        <w:pStyle w:val="Listaconvietas"/>
+        <w:spacing w:after="40"/>
+      </w:pPr>
+      <w:r>
+        <w:rPr>
+          <w:b/>
+        </w:rPr>
+        <w:t xml:space="preserve">Concepto 6 — Revisión Administrativa (o de Gestión): </w:t>
+      </w:r>
+      <w:r>
+        <w:rPr>
+          <w:b w:val="0"/>
+        </w:rPr>
+        <w:t xml:space="preserve">Es la evaluación formal del estado del proyecto en relación con su plan. Objetivos: asegurar el progreso del proyecto, recomendar acciones correctivas y asegurar la adecuada asignación de recursos. Entradas: objetivos de la revisión, lista de temas a tratar, calendario actual del proyecto, informes de revisiones anteriores e informe de los elementos terminados o en desarrollo. Salidas: las entradas de la revisión, el estado actual del proyecto y la lista de recomendaciones.</w:t>
+      </w:r>
+    </w:p>
+    <w:p>
+      <w:pPr>
+        <w:pStyle w:val="Listaconvietas"/>
+        <w:spacing w:after="40"/>
+      </w:pPr>
+      <w:r>
+        <w:rPr>
+          <w:b/>
+        </w:rPr>
+        <w:t xml:space="preserve">Concepto 7 — Roles del equipo de revisión: </w:t>
+      </w:r>
+      <w:r>
+        <w:rPr>
+          <w:b w:val="0"/>
+        </w:rPr>
+        <w:t xml:space="preserve">Líder (planifica la revisión, la conduce y asegura que se produzca el informe de revisión); Revisores (se preparan individualmente y formulan recomendaciones para mejorar las anomalías detectadas); Registrador (documenta los problemas, decisiones y recomendaciones hechas por el equipo); y Responsables de lo que va a ser examinado (dos o más personas que proveen la información y preparan el material de entrada).</w:t>
+      </w:r>
+    </w:p>
+    <w:p>
+      <w:pPr>
+        <w:pStyle w:val="Listaconvietas"/>
+        <w:spacing w:after="40"/>
+      </w:pPr>
+      <w:r>
+        <w:rPr>
+          <w:b/>
+        </w:rPr>
+        <w:t xml:space="preserve">Concepto 8 — Procedimiento en tres momentos: </w:t>
+      </w:r>
+      <w:r>
+        <w:rPr>
+          <w:b w:val="0"/>
+        </w:rPr>
+        <w:t xml:space="preserve">Planificación: establecer el equipo de revisión, fijar fecha y lugar y distribuir a tiempo el material de entrada. Preparación: revisar individualmente el material distribuido y confeccionar una lista de preguntas y tópicos a discutir. Durante la reunión: examinar si el estado del proyecto cumple con el estado esperado, registrar todas las desviaciones, generar la lista de tareas y recomendaciones para los niveles administrativos superiores y recomendar el curso de acción a tomar.</w:t>
+      </w:r>
+    </w:p>
+    <w:p>
+      <w:pPr>
+        <w:pStyle w:val="Listaconvietas"/>
+        <w:spacing w:after="40"/>
+      </w:pPr>
+      <w:r>
+        <w:rPr>
+          <w:b/>
+        </w:rPr>
+        <w:t xml:space="preserve">Concepto 9 — Revisión entre pares (peer review): </w:t>
+      </w:r>
+      <w:r>
+        <w:rPr>
+          <w:b w:val="0"/>
+        </w:rPr>
+        <w:t xml:space="preserve">Es la revisión de un producto de trabajo de software por parte de los compañeros del desarrollador, con el objeto de identificar defectos y mejoras y comprobar que el artefacto cumple el propósito para el que fue construido. La sesión tiene un tiempo límite de 60 minutos.</w:t>
+      </w:r>
+    </w:p>
+    <w:p>
+      <w:pPr>
+        <w:spacing w:after="80"/>
       </w:pPr>
       <w:r>
         <w:rPr>
@@ -486,7 +584,10 @@
         <w:t xml:space="preserve">• Glosario / Métricas Relevantes: </w:t>
       </w:r>
       <w:r>
-        <w:t>[Líneas de código, Métricas de Calidad, Cobertura, Puntos de Función, etc.]</w:t>
+        <w:rPr>
+          <w:b w:val="0"/>
+        </w:rPr>
+        <w:t xml:space="preserve">Calidad, Gold plating, Análisis marginal, Verificación, Validación, V&amp;V, IEEE Std 1028-2008, Revisión de Gestión, Revisión Técnica, Inspección, Walk-through, Auditoría, Revisión entre pares (peer review), Anomalía, Discrepancia, Defecto, SRS (Software Requirements Specification), Lista de chequeo, Tiempo límite de la sesión de revisión (60 minutos).</w:t>
       </w:r>
     </w:p>
     <w:p>
@@ -703,7 +804,7 @@
               <w:rPr>
                 <w:sz w:val="19"/>
               </w:rPr>
-              <w:t>1</w:t>
+              <w:t xml:space="preserve">1</w:t>
             </w:r>
           </w:p>
         </w:tc>
@@ -726,7 +827,7 @@
               <w:rPr>
                 <w:sz w:val="19"/>
               </w:rPr>
-              <w:t>[Ej. Taller Puntos de Función]</w:t>
+              <w:t xml:space="preserve">Revisión entre pares del SRS (rol Par / auditor individual)</w:t>
             </w:r>
           </w:p>
         </w:tc>
@@ -749,7 +850,7 @@
               <w:rPr>
                 <w:sz w:val="19"/>
               </w:rPr>
-              <w:t>[Cálculo de PF no ajustados para el caso de estudio X]</w:t>
+              <w:t xml:space="preserve">Revisar el documento SRS del Grupo A y diligenciar la lista de chequeo de auditoría individual sobre los requisitos.</w:t>
             </w:r>
           </w:p>
         </w:tc>
@@ -772,7 +873,7 @@
               <w:rPr>
                 <w:sz w:val="19"/>
               </w:rPr>
-              <w:t>[Tabla de conteo en repo]</w:t>
+              <w:t xml:space="preserve">ListaChequeo_Requisitos_Software.xlsx y RevisionGrupoANDRES.docx (Clase#1/Tarea1/)</w:t>
             </w:r>
           </w:p>
         </w:tc>
@@ -796,7 +897,7 @@
               <w:rPr>
                 <w:sz w:val="19"/>
               </w:rPr>
-              <w:t>[Completado]</w:t>
+              <w:t xml:space="preserve">Completado</w:t>
             </w:r>
           </w:p>
         </w:tc>
@@ -824,7 +925,7 @@
               <w:rPr>
                 <w:sz w:val="19"/>
               </w:rPr>
-              <w:t>2</w:t>
+              <w:t xml:space="preserve">2</w:t>
             </w:r>
           </w:p>
         </w:tc>
@@ -846,7 +947,7 @@
               <w:rPr>
                 <w:sz w:val="19"/>
               </w:rPr>
-              <w:t>[Ej. Ejercicio de Diagramación]</w:t>
+              <w:t xml:space="preserve">Preparación de la exposición “Inspecciones” (IEEE 1028)</w:t>
             </w:r>
           </w:p>
         </w:tc>
@@ -868,7 +969,7 @@
               <w:rPr>
                 <w:sz w:val="19"/>
               </w:rPr>
-              <w:t>[Diseño de diagrama de secuencia del módulo Login]</w:t>
+              <w:t xml:space="preserve">Construir la definición, la descripción del proceso y el instructivo de cómo aplicar el método de inspección, para exponer el 12 de agosto.</w:t>
             </w:r>
           </w:p>
         </w:tc>
@@ -890,7 +991,7 @@
               <w:rPr>
                 <w:sz w:val="19"/>
               </w:rPr>
-              <w:t>[Diagrama / Script Mermaid]</w:t>
+              <w:t xml:space="preserve">Inspecciones_IEEE1028_SIGRA.pptx (Clase#1/SIGRA TRABAJO EQUIPO/)</w:t>
             </w:r>
           </w:p>
         </w:tc>
@@ -913,7 +1014,251 @@
               <w:rPr>
                 <w:sz w:val="19"/>
               </w:rPr>
-              <w:t>[Completado]</w:t>
+              <w:t xml:space="preserve">Completado</w:t>
+            </w:r>
+          </w:p>
+        </w:tc>
+      </w:tr>
+      <w:tr>
+        <w:trPr>
+          <w:jc w:val="center"/>
+        </w:trPr>
+        <w:tc>
+          <w:tcPr>
+            <w:tcW w:w="720" w:type="dxa"/>
+            <w:shd w:val="clear" w:color="auto" w:fill="F9F9F9"/>
+            <w:tcMar>
+              <w:top w:w="120" w:type="dxa"/>
+              <w:left w:w="100" w:type="dxa"/>
+              <w:bottom w:w="120" w:type="dxa"/>
+              <w:right w:w="100" w:type="dxa"/>
+            </w:tcMar>
+          </w:tcPr>
+          <w:p>
+            <w:pPr>
+              <w:spacing w:after="0"/>
+              <w:jc w:val="center"/>
+            </w:pPr>
+            <w:r>
+              <w:rPr>
+                <w:sz w:val="19"/>
+              </w:rPr>
+              <w:t xml:space="preserve">3</w:t>
+            </w:r>
+          </w:p>
+        </w:tc>
+        <w:tc>
+          <w:tcPr>
+            <w:tcW w:w="2592" w:type="dxa"/>
+            <w:shd w:val="clear" w:color="auto" w:fill="F9F9F9"/>
+            <w:tcMar>
+              <w:top w:w="120" w:type="dxa"/>
+              <w:left w:w="100" w:type="dxa"/>
+              <w:bottom w:w="120" w:type="dxa"/>
+              <w:right w:w="100" w:type="dxa"/>
+            </w:tcMar>
+          </w:tcPr>
+          <w:p>
+            <w:pPr>
+              <w:spacing w:after="0"/>
+            </w:pPr>
+            <w:r>
+              <w:rPr>
+                <w:sz w:val="19"/>
+              </w:rPr>
+              <w:t xml:space="preserve">Estudio del estándar IEEE Std 1028-2008</w:t>
+            </w:r>
+          </w:p>
+        </w:tc>
+        <w:tc>
+          <w:tcPr>
+            <w:tcW w:w="3168" w:type="dxa"/>
+            <w:shd w:val="clear" w:color="auto" w:fill="F9F9F9"/>
+            <w:tcMar>
+              <w:top w:w="120" w:type="dxa"/>
+              <w:left w:w="100" w:type="dxa"/>
+              <w:bottom w:w="120" w:type="dxa"/>
+              <w:right w:w="100" w:type="dxa"/>
+            </w:tcMar>
+          </w:tcPr>
+          <w:p>
+            <w:pPr>
+              <w:spacing w:after="0"/>
+            </w:pPr>
+            <w:r>
+              <w:rPr>
+                <w:sz w:val="19"/>
+              </w:rPr>
+              <w:t xml:space="preserve">Lectura del estándar y elaboración de la guía de estudio del proceso de inspección de software.</w:t>
+            </w:r>
+          </w:p>
+        </w:tc>
+        <w:tc>
+          <w:tcPr>
+            <w:tcW w:w="1872" w:type="dxa"/>
+            <w:shd w:val="clear" w:color="auto" w:fill="F9F9F9"/>
+            <w:tcMar>
+              <w:top w:w="120" w:type="dxa"/>
+              <w:left w:w="100" w:type="dxa"/>
+              <w:bottom w:w="120" w:type="dxa"/>
+              <w:right w:w="100" w:type="dxa"/>
+            </w:tcMar>
+          </w:tcPr>
+          <w:p>
+            <w:pPr>
+              <w:spacing w:after="0"/>
+            </w:pPr>
+            <w:r>
+              <w:rPr>
+                <w:sz w:val="19"/>
+              </w:rPr>
+              <w:t xml:space="preserve">Guía de Estudio_ El Proceso de Inspección de Software.docx / Inspecciones_IEEE1028.md</w:t>
+            </w:r>
+          </w:p>
+        </w:tc>
+        <w:tc>
+          <w:tcPr>
+            <w:tcW w:w="1008" w:type="dxa"/>
+            <w:shd w:val="clear" w:color="auto" w:fill="F9F9F9"/>
+            <w:tcMar>
+              <w:top w:w="120" w:type="dxa"/>
+              <w:left w:w="100" w:type="dxa"/>
+              <w:bottom w:w="120" w:type="dxa"/>
+              <w:right w:w="100" w:type="dxa"/>
+            </w:tcMar>
+          </w:tcPr>
+          <w:p>
+            <w:pPr>
+              <w:spacing w:after="0"/>
+              <w:jc w:val="center"/>
+            </w:pPr>
+            <w:r>
+              <w:rPr>
+                <w:sz w:val="19"/>
+              </w:rPr>
+              <w:t xml:space="preserve">Completado</w:t>
+            </w:r>
+          </w:p>
+        </w:tc>
+      </w:tr>
+      <w:tr>
+        <w:trPr>
+          <w:jc w:val="center"/>
+        </w:trPr>
+        <w:tc>
+          <w:tcPr>
+            <w:tcW w:w="720" w:type="dxa"/>
+            <w:shd w:val="clear" w:color="auto" w:fill="F9F9F9"/>
+            <w:tcMar>
+              <w:top w:w="120" w:type="dxa"/>
+              <w:left w:w="100" w:type="dxa"/>
+              <w:bottom w:w="120" w:type="dxa"/>
+              <w:right w:w="100" w:type="dxa"/>
+            </w:tcMar>
+          </w:tcPr>
+          <w:p>
+            <w:pPr>
+              <w:spacing w:after="0"/>
+              <w:jc w:val="center"/>
+            </w:pPr>
+            <w:r>
+              <w:rPr>
+                <w:sz w:val="19"/>
+              </w:rPr>
+              <w:t xml:space="preserve">4</w:t>
+            </w:r>
+          </w:p>
+        </w:tc>
+        <w:tc>
+          <w:tcPr>
+            <w:tcW w:w="2592" w:type="dxa"/>
+            <w:shd w:val="clear" w:color="auto" w:fill="F9F9F9"/>
+            <w:tcMar>
+              <w:top w:w="120" w:type="dxa"/>
+              <w:left w:w="100" w:type="dxa"/>
+              <w:bottom w:w="120" w:type="dxa"/>
+              <w:right w:w="100" w:type="dxa"/>
+            </w:tcMar>
+          </w:tcPr>
+          <w:p>
+            <w:pPr>
+              <w:spacing w:after="0"/>
+            </w:pPr>
+            <w:r>
+              <w:rPr>
+                <w:sz w:val="19"/>
+              </w:rPr>
+              <w:t xml:space="preserve">Reconocimiento de artefactos del ciclo de vida</w:t>
+            </w:r>
+          </w:p>
+        </w:tc>
+        <w:tc>
+          <w:tcPr>
+            <w:tcW w:w="3168" w:type="dxa"/>
+            <w:shd w:val="clear" w:color="auto" w:fill="F9F9F9"/>
+            <w:tcMar>
+              <w:top w:w="120" w:type="dxa"/>
+              <w:left w:w="100" w:type="dxa"/>
+              <w:bottom w:w="120" w:type="dxa"/>
+              <w:right w:w="100" w:type="dxa"/>
+            </w:tcMar>
+          </w:tcPr>
+          <w:p>
+            <w:pPr>
+              <w:spacing w:after="0"/>
+            </w:pPr>
+            <w:r>
+              <w:rPr>
+                <w:sz w:val="19"/>
+              </w:rPr>
+              <w:t xml:space="preserve">Revisar la plantilla de artefactos por fase: gestión, requerimientos, arquitectura, desarrollo, pruebas, implementación, operación y entrega final.</w:t>
+            </w:r>
+          </w:p>
+        </w:tc>
+        <w:tc>
+          <w:tcPr>
+            <w:tcW w:w="1872" w:type="dxa"/>
+            <w:shd w:val="clear" w:color="auto" w:fill="F9F9F9"/>
+            <w:tcMar>
+              <w:top w:w="120" w:type="dxa"/>
+              <w:left w:w="100" w:type="dxa"/>
+              <w:bottom w:w="120" w:type="dxa"/>
+              <w:right w:w="100" w:type="dxa"/>
+            </w:tcMar>
+          </w:tcPr>
+          <w:p>
+            <w:pPr>
+              <w:spacing w:after="0"/>
+            </w:pPr>
+            <w:r>
+              <w:rPr>
+                <w:sz w:val="19"/>
+              </w:rPr>
+              <w:t xml:space="preserve">Carpeta Clase#1/Artefactos plantilla OneDrive/</w:t>
+            </w:r>
+          </w:p>
+        </w:tc>
+        <w:tc>
+          <w:tcPr>
+            <w:tcW w:w="1008" w:type="dxa"/>
+            <w:shd w:val="clear" w:color="auto" w:fill="F9F9F9"/>
+            <w:tcMar>
+              <w:top w:w="120" w:type="dxa"/>
+              <w:left w:w="100" w:type="dxa"/>
+              <w:bottom w:w="120" w:type="dxa"/>
+              <w:right w:w="100" w:type="dxa"/>
+            </w:tcMar>
+          </w:tcPr>
+          <w:p>
+            <w:pPr>
+              <w:spacing w:after="0"/>
+              <w:jc w:val="center"/>
+            </w:pPr>
+            <w:r>
+              <w:rPr>
+                <w:sz w:val="19"/>
+              </w:rPr>
+              <w:t xml:space="preserve">Completado</w:t>
             </w:r>
           </w:p>
         </w:tc>
@@ -968,11 +1313,78 @@
             </w:pPr>
             <w:r>
               <w:rPr>
+                <w:b w:val="0"/>
                 <w:i/>
                 <w:color w:val="595959"/>
                 <w:sz w:val="19"/>
               </w:rPr>
-              <w:t>[ Adjunte aquí la captura de pantalla, imagen del diagrama o código Mermaid / PlantUML ]</w:t>
+              <w:t xml:space="preserve">Evidencia 1: lista de chequeo de requisitos diligenciada durante la revisión entre pares del SRS del Grupo A (Clase#1/Tarea1/ListaChequeo_Requisitos_Software.xlsx).</w:t>
+            </w:r>
+          </w:p>
+          <w:p>
+            <w:pPr>
+              <w:spacing w:after="0"/>
+              <w:jc w:val="center"/>
+            </w:pPr>
+            <w:r>
+              <w:rPr>
+                <w:b w:val="0"/>
+                <w:i/>
+                <w:color w:val="595959"/>
+                <w:sz w:val="19"/>
+              </w:rPr>
+              <w:t xml:space="preserve">Evidencia 2: material de la sesión — Clase#1/Clase 5 de Agosto 2026.pdf</w:t>
+            </w:r>
+          </w:p>
+          <w:p>
+            <w:pPr>
+              <w:spacing w:after="0"/>
+              <w:jc w:val="center"/>
+            </w:pPr>
+            <w:r>
+              <w:rPr>
+                <w:b w:val="0"/>
+                <w:i/>
+                <w:color w:val="595959"/>
+                <w:sz w:val="19"/>
+              </w:rPr>
+              <w:t xml:space="preserve">Evidencia 3: presentación del equipo — Clase#1/SIGRA TRABAJO EQUIPO/Inspecciones_IEEE1028_SIGRA.pptx</w:t>
+            </w:r>
+          </w:p>
+          <w:p>
+            <w:r>
+              <w:drawing>
+                <wp:inline xmlns:a="http://schemas.openxmlformats.org/drawingml/2006/main" xmlns:pic="http://schemas.openxmlformats.org/drawingml/2006/picture">
+                  <wp:extent cx="5486400" cy="2636709"/>
+                  <wp:docPr id="1" name="Picture 1"/>
+                  <wp:cNvGraphicFramePr>
+                    <a:graphicFrameLocks noChangeAspect="1"/>
+                  </wp:cNvGraphicFramePr>
+                  <a:graphic>
+                    <a:graphicData uri="http://schemas.openxmlformats.org/drawingml/2006/picture">
+                      <pic:pic>
+                        <pic:nvPicPr>
+                          <pic:cNvPr id="0" name="tarea1-1.png"/>
+                          <pic:cNvPicPr/>
+                        </pic:nvPicPr>
+                        <pic:blipFill>
+                          <a:blip r:embed="rId8"/>
+                          <a:stretch>
+                            <a:fillRect/>
+                          </a:stretch>
+                        </pic:blipFill>
+                        <pic:spPr>
+                          <a:xfrm>
+                            <a:off x="0" y="0"/>
+                            <a:ext cx="5486400" cy="2636709"/>
+                          </a:xfrm>
+                          <a:prstGeom prst="rect"/>
+                        </pic:spPr>
+                      </pic:pic>
+                    </a:graphicData>
+                  </a:graphic>
+                </wp:inline>
+              </w:drawing>
             </w:r>
           </w:p>
         </w:tc>
@@ -1129,7 +1541,7 @@
               <w:rPr>
                 <w:sz w:val="19"/>
               </w:rPr>
-              <w:t>[DD/MM/AAAA]</w:t>
+              <w:t xml:space="preserve">05/08/2026</w:t>
             </w:r>
           </w:p>
         </w:tc>
@@ -1152,7 +1564,7 @@
               <w:rPr>
                 <w:sz w:val="19"/>
               </w:rPr>
-              <w:t>2.0 h</w:t>
+              <w:t xml:space="preserve">1.5 h</w:t>
             </w:r>
           </w:p>
         </w:tc>
@@ -1174,7 +1586,7 @@
               <w:rPr>
                 <w:sz w:val="19"/>
               </w:rPr>
-              <w:t>Análisis de requisitos e integración de endpoints de API REST.</w:t>
+              <w:t xml:space="preserve">Lectura del estándar IEEE Std 1028-2008 y elaboración de la guía de estudio del proceso de inspección.</w:t>
             </w:r>
           </w:p>
         </w:tc>
@@ -1202,7 +1614,7 @@
               <w:rPr>
                 <w:sz w:val="19"/>
               </w:rPr>
-              <w:t>[DD/MM/AAAA]</w:t>
+              <w:t xml:space="preserve">06/08/2026</w:t>
             </w:r>
           </w:p>
         </w:tc>
@@ -1225,7 +1637,7 @@
               <w:rPr>
                 <w:sz w:val="19"/>
               </w:rPr>
-              <w:t>2.5 h</w:t>
+              <w:t xml:space="preserve">1.5 h</w:t>
             </w:r>
           </w:p>
         </w:tc>
@@ -1247,7 +1659,7 @@
               <w:rPr>
                 <w:sz w:val="19"/>
               </w:rPr>
-              <w:t>Corrección de bugs en capa de persistencia y ejecución de pruebas unitarias.</w:t>
+              <w:t xml:space="preserve">Revisión entre pares del SRS del Grupo A y diligenciamiento de la lista de chequeo de auditoría individual.</w:t>
             </w:r>
           </w:p>
         </w:tc>
@@ -1277,7 +1689,7 @@
                 <w:b/>
                 <w:sz w:val="20"/>
               </w:rPr>
-              <w:t>Total Horas:</w:t>
+              <w:t xml:space="preserve">08/08/2026</w:t>
             </w:r>
           </w:p>
         </w:tc>
@@ -1303,7 +1715,7 @@
                 <w:color w:val="1F497D"/>
                 <w:sz w:val="20"/>
               </w:rPr>
-              <w:t>4.5 h</w:t>
+              <w:t xml:space="preserve">2.0 h</w:t>
             </w:r>
           </w:p>
         </w:tc>
@@ -1328,7 +1740,80 @@
                 <w:color w:val="595959"/>
                 <w:sz w:val="18"/>
               </w:rPr>
-              <w:t>(Verificación: Cumple con la exigencia de ≥ 4.0 horas semanales)</w:t>
+              <w:t xml:space="preserve">Preparación de la presentación de Inspecciones (definición, proceso e instructivo) para exponer el 12 de agosto.</w:t>
+            </w:r>
+          </w:p>
+        </w:tc>
+      </w:tr>
+      <w:tr>
+        <w:trPr>
+          <w:jc w:val="center"/>
+        </w:trPr>
+        <w:tc>
+          <w:tcPr>
+            <w:tcW w:w="1728" w:type="dxa"/>
+            <w:tcMar>
+              <w:top w:w="120" w:type="dxa"/>
+              <w:left w:w="100" w:type="dxa"/>
+              <w:bottom w:w="120" w:type="dxa"/>
+              <w:right w:w="100" w:type="dxa"/>
+            </w:tcMar>
+          </w:tcPr>
+          <w:p>
+            <w:pPr>
+              <w:spacing w:after="0"/>
+              <w:jc w:val="center"/>
+            </w:pPr>
+            <w:r>
+              <w:rPr>
+                <w:sz w:val="19"/>
+              </w:rPr>
+              <w:t xml:space="preserve">Total Horas:</w:t>
+            </w:r>
+          </w:p>
+        </w:tc>
+        <w:tc>
+          <w:tcPr>
+            <w:tcW w:w="1872" w:type="dxa"/>
+            <w:tcMar>
+              <w:top w:w="120" w:type="dxa"/>
+              <w:left w:w="100" w:type="dxa"/>
+              <w:bottom w:w="120" w:type="dxa"/>
+              <w:right w:w="100" w:type="dxa"/>
+            </w:tcMar>
+          </w:tcPr>
+          <w:p>
+            <w:pPr>
+              <w:spacing w:after="0"/>
+              <w:jc w:val="center"/>
+            </w:pPr>
+            <w:r>
+              <w:rPr>
+                <w:sz w:val="19"/>
+              </w:rPr>
+              <w:t xml:space="preserve">5.0 h</w:t>
+            </w:r>
+          </w:p>
+        </w:tc>
+        <w:tc>
+          <w:tcPr>
+            <w:tcW w:w="5760" w:type="dxa"/>
+            <w:tcMar>
+              <w:top w:w="120" w:type="dxa"/>
+              <w:left w:w="100" w:type="dxa"/>
+              <w:bottom w:w="120" w:type="dxa"/>
+              <w:right w:w="100" w:type="dxa"/>
+            </w:tcMar>
+          </w:tcPr>
+          <w:p>
+            <w:pPr>
+              <w:spacing w:after="0"/>
+            </w:pPr>
+            <w:r>
+              <w:rPr>
+                <w:sz w:val="19"/>
+              </w:rPr>
+              <w:t xml:space="preserve">(Verificación: Cumple con la exigencia de ≥ 4.0 horas semanales)</w:t>
             </w:r>
           </w:p>
         </w:tc>
@@ -1381,7 +1866,7 @@
         <w:t xml:space="preserve">• URL del Repositorio: </w:t>
       </w:r>
       <w:r>
-        <w:t>[https://github.com/usuario/proyecto-software4]</w:t>
+        <w:t xml:space="preserve">https://github.com/andrias01/software-iv-documentacion-calidad</w:t>
       </w:r>
     </w:p>
     <w:p>
@@ -1395,7 +1880,7 @@
         <w:t xml:space="preserve">• Rama de Trabajo: </w:t>
       </w:r>
       <w:r>
-        <w:t>[feature/HU-001-autenticacion]</w:t>
+        <w:t xml:space="preserve">master (repositorio de documentación: los avances se registran como commits directos)</w:t>
       </w:r>
     </w:p>
     <w:tbl>
@@ -1549,7 +2034,7 @@
               <w:rPr>
                 <w:sz w:val="19"/>
               </w:rPr>
-              <w:t>#a1b2c3d</w:t>
+              <w:t xml:space="preserve">#b8263b6</w:t>
             </w:r>
           </w:p>
         </w:tc>
@@ -1572,7 +2057,7 @@
               <w:rPr>
                 <w:sz w:val="19"/>
               </w:rPr>
-              <w:t>feat: agrega validación de contraseña con Hash Arg2</w:t>
+              <w:t xml:space="preserve">docs: agregar README inicial del proyecto</w:t>
             </w:r>
           </w:p>
         </w:tc>
@@ -1596,7 +2081,7 @@
               <w:rPr>
                 <w:sz w:val="19"/>
               </w:rPr>
-              <w:t>#12</w:t>
+              <w:t xml:space="preserve">Sin PR</w:t>
             </w:r>
           </w:p>
         </w:tc>
@@ -1620,7 +2105,7 @@
               <w:rPr>
                 <w:sz w:val="19"/>
               </w:rPr>
-              <w:t>Merged</w:t>
+              <w:t xml:space="preserve">Commit directo a master</w:t>
             </w:r>
           </w:p>
         </w:tc>
@@ -1648,7 +2133,7 @@
               <w:rPr>
                 <w:sz w:val="19"/>
               </w:rPr>
-              <w:t>#e5f6g7h</w:t>
+              <w:t xml:space="preserve">#b40fb6e</w:t>
             </w:r>
           </w:p>
         </w:tc>
@@ -1670,7 +2155,7 @@
               <w:rPr>
                 <w:sz w:val="19"/>
               </w:rPr>
-              <w:t>test: añade casos de prueba unitarios para servicio auth</w:t>
+              <w:t xml:space="preserve">chore: ignorar archivos temporales de Office y Windows</w:t>
             </w:r>
           </w:p>
         </w:tc>
@@ -1693,7 +2178,7 @@
               <w:rPr>
                 <w:sz w:val="19"/>
               </w:rPr>
-              <w:t>#14</w:t>
+              <w:t xml:space="preserve">Sin PR</w:t>
             </w:r>
           </w:p>
         </w:tc>
@@ -1716,7 +2201,107 @@
               <w:rPr>
                 <w:sz w:val="19"/>
               </w:rPr>
-              <w:t>Open</w:t>
+              <w:t xml:space="preserve">Commit directo a master</w:t>
+            </w:r>
+          </w:p>
+        </w:tc>
+      </w:tr>
+      <w:tr>
+        <w:trPr>
+          <w:jc w:val="center"/>
+        </w:trPr>
+        <w:tc>
+          <w:tcPr>
+            <w:tcW w:w="1728" w:type="dxa"/>
+            <w:shd w:val="clear" w:color="auto" w:fill="F9F9F9"/>
+            <w:tcMar>
+              <w:top w:w="120" w:type="dxa"/>
+              <w:left w:w="100" w:type="dxa"/>
+              <w:bottom w:w="120" w:type="dxa"/>
+              <w:right w:w="100" w:type="dxa"/>
+            </w:tcMar>
+          </w:tcPr>
+          <w:p>
+            <w:pPr>
+              <w:spacing w:after="0"/>
+              <w:jc w:val="center"/>
+            </w:pPr>
+            <w:r>
+              <w:rPr>
+                <w:sz w:val="19"/>
+              </w:rPr>
+              <w:t xml:space="preserve">#14a7263</w:t>
+            </w:r>
+          </w:p>
+        </w:tc>
+        <w:tc>
+          <w:tcPr>
+            <w:tcW w:w="4464" w:type="dxa"/>
+            <w:shd w:val="clear" w:color="auto" w:fill="F9F9F9"/>
+            <w:tcMar>
+              <w:top w:w="120" w:type="dxa"/>
+              <w:left w:w="100" w:type="dxa"/>
+              <w:bottom w:w="120" w:type="dxa"/>
+              <w:right w:w="100" w:type="dxa"/>
+            </w:tcMar>
+          </w:tcPr>
+          <w:p>
+            <w:pPr>
+              <w:spacing w:after="0"/>
+            </w:pPr>
+            <w:r>
+              <w:rPr>
+                <w:sz w:val="19"/>
+              </w:rPr>
+              <w:t xml:space="preserve">docs(clase1): agregar presentacion del 05/08/2026 y actualizar lista de chequeo de requisitos</w:t>
+            </w:r>
+          </w:p>
+        </w:tc>
+        <w:tc>
+          <w:tcPr>
+            <w:tcW w:w="1728" w:type="dxa"/>
+            <w:shd w:val="clear" w:color="auto" w:fill="F9F9F9"/>
+            <w:tcMar>
+              <w:top w:w="120" w:type="dxa"/>
+              <w:left w:w="100" w:type="dxa"/>
+              <w:bottom w:w="120" w:type="dxa"/>
+              <w:right w:w="100" w:type="dxa"/>
+            </w:tcMar>
+          </w:tcPr>
+          <w:p>
+            <w:pPr>
+              <w:spacing w:after="0"/>
+              <w:jc w:val="center"/>
+            </w:pPr>
+            <w:r>
+              <w:rPr>
+                <w:sz w:val="19"/>
+              </w:rPr>
+              <w:t xml:space="preserve">Sin PR</w:t>
+            </w:r>
+          </w:p>
+        </w:tc>
+        <w:tc>
+          <w:tcPr>
+            <w:tcW w:w="1440" w:type="dxa"/>
+            <w:shd w:val="clear" w:color="auto" w:fill="F9F9F9"/>
+            <w:tcMar>
+              <w:top w:w="120" w:type="dxa"/>
+              <w:left w:w="100" w:type="dxa"/>
+              <w:bottom w:w="120" w:type="dxa"/>
+              <w:right w:w="100" w:type="dxa"/>
+            </w:tcMar>
+          </w:tcPr>
+          <w:p>
+            <w:pPr>
+              <w:spacing w:after="0"/>
+              <w:jc w:val="center"/>
+            </w:pPr>
+            <w:r>
+              <w:rPr>
+                <w:sz w:val="19"/>
+              </w:rPr>
+              <w:t xml:space="preserve">Commit directo a master</w:t>
             </w:r>
           </w:p>
         </w:tc>
@@ -1747,13 +2332,11 @@
         <w:t>1. Bloqueos Encontrados (Blockers):</w:t>
       </w:r>
       <w:r>
-        <w:rPr>
-          <w:b/>
-        </w:rPr>
+        <w:t xml:space="preserve"/>
         <w:br/>
-      </w:r>
-      <w:r>
-        <w:t xml:space="preserve">   • [Describa la dificultad técnica, conceptual o logística que le impidió avanzar de manera óptima]</w:t>
+        <w:t xml:space="preserve">   • Al comienzo confundía verificación con validación, porque en la práctica las dos buscan que el software “esté bien”.</w:t>
+        <w:br/>
+        <w:t xml:space="preserve">   • El estándar IEEE Std 1028-2008 está en inglés y es extenso, lo que hizo lenta la lectura para separar con claridad los cinco tipos de revisión.</w:t>
       </w:r>
     </w:p>
     <w:p>
@@ -1767,13 +2350,11 @@
         <w:t>2. Estrategia de Solución / Mitigación:</w:t>
       </w:r>
       <w:r>
-        <w:rPr>
-          <w:b/>
-        </w:rPr>
+        <w:t xml:space="preserve"/>
         <w:br/>
-      </w:r>
-      <w:r>
-        <w:t xml:space="preserve">   • [Acción realizada para resolver el bloqueo (ej. consulta de documentación, sesión de code review con compañeros)]</w:t>
+        <w:t xml:space="preserve">   • Armé un cuadro comparativo con las cinco diferencias vistas en clase: si ejecuta o no código, qué métodos usa, qué comprueba, cuándo encuentra los errores y quién la realiza.</w:t>
+        <w:br/>
+        <w:t xml:space="preserve">   • Leí solo la cláusula de Inspecciones del estándar y la contrasté con las diapositivas de la sesión y con la guía de estudio del equipo.</w:t>
       </w:r>
     </w:p>
     <w:p>
@@ -1788,13 +2369,11 @@
         <w:t>3. Plan de Acción para la Próxima Semana:</w:t>
       </w:r>
       <w:r>
-        <w:rPr>
-          <w:b/>
-        </w:rPr>
+        <w:t xml:space="preserve"/>
         <w:br/>
-      </w:r>
-      <w:r>
-        <w:t xml:space="preserve">   • [Meta concreta del proyecto a entregar o módulo a finalizar en el siguiente ciclo semanal]</w:t>
+        <w:t xml:space="preserve">   • Terminar y ensayar la exposición de Inspecciones para presentarla el 12 de agosto.</w:t>
+        <w:br/>
+        <w:t xml:space="preserve">   • Consolidar los entregables del equipo revisor: lista de chequeo grupal, registro de prompts de IA e informe de recomendaciones.</w:t>
       </w:r>
     </w:p>
     <w:p>
@@ -1820,7 +2399,7 @@
         <w:rPr>
           <w:b/>
         </w:rPr>
-        <w:t xml:space="preserve">☐  </w:t>
+        <w:t xml:space="preserve">☑  </w:t>
       </w:r>
       <w:r>
         <w:rPr>
@@ -1838,7 +2417,7 @@
         <w:rPr>
           <w:b/>
         </w:rPr>
-        <w:t xml:space="preserve">☐  </w:t>
+        <w:t xml:space="preserve">☑  </w:t>
       </w:r>
       <w:r>
         <w:rPr>
@@ -1856,7 +2435,7 @@
         <w:rPr>
           <w:b/>
         </w:rPr>
-        <w:t xml:space="preserve">☐  </w:t>
+        <w:t xml:space="preserve">☑  </w:t>
       </w:r>
       <w:r>
         <w:rPr>
@@ -1876,7 +2455,7 @@
         <w:t xml:space="preserve">Firma Digital / Confirmación del Estudiante: </w:t>
       </w:r>
       <w:r>
-        <w:t>[Nombre Completo / Enlace a perfil GitHub o ID]</w:t>
+        <w:t xml:space="preserve">Andres Felipe Velez Alcaraz — https://github.com/andrias01 — Código 1017245136</w:t>
       </w:r>
     </w:p>
     <w:p>
@@ -1890,7 +2469,7 @@
         <w:t xml:space="preserve">Fecha de Subida: </w:t>
       </w:r>
       <w:r>
-        <w:t>[DD/MM/AAAA - HH:MM]</w:t>
+        <w:t xml:space="preserve">23/08/2026</w:t>
       </w:r>
     </w:p>
     <w:sectPr>

</xml_diff>